<commit_message>
Integrate Google Calendar sync
Add Google Calendar integration and admin settings.

Backend: added googleapis dependency; new utils/googleCalendar.js helper; new setting controller and routes (save/test calendar, save service account JSON); app registers /api/settings route. eventController updated to insert/update/delete events on Google Calendar, sync participant changes, and store google_event_id. Added .gitignore entry for config JSON. Database migration adds events.google_event_id.

Frontend: new ManageGoogleCalendarView, router and sidebar links, UI/UX tweaks in ManageEventView (upcoming highlight, auto end time, sorting) and ManageSomtopView (items per page). Templates updated.
</commit_message>
<xml_diff>
--- a/backend/templates/leave_template.docx
+++ b/backend/templates/leave_template.docx
@@ -2,6 +2,31 @@
 <file path=word/document.xml><?xml version="1.0" encoding="utf-8"?>
 <w:document xmlns:wpc="http://schemas.microsoft.com/office/word/2010/wordprocessingCanvas" xmlns:cx="http://schemas.microsoft.com/office/drawing/2014/chartex" xmlns:cx1="http://schemas.microsoft.com/office/drawing/2015/9/8/chartex" xmlns:mc="http://schemas.openxmlformats.org/markup-compatibility/2006" xmlns:o="urn:schemas-microsoft-com:office:office" xmlns:r="http://schemas.openxmlformats.org/officeDocument/2006/relationships" xmlns:m="http://schemas.openxmlformats.org/officeDocument/2006/math" xmlns:v="urn:schemas-microsoft-com:vml" xmlns:wp14="http://schemas.microsoft.com/office/word/2010/wordprocessingDrawing" xmlns:wp="http://schemas.openxmlformats.org/drawingml/2006/wordprocessingDrawing" xmlns:w10="urn:schemas-microsoft-com:office:word" xmlns:w="http://schemas.openxmlformats.org/wordprocessingml/2006/main" xmlns:w14="http://schemas.microsoft.com/office/word/2010/wordml" xmlns:w15="http://schemas.microsoft.com/office/word/2012/wordml" xmlns:w16se="http://schemas.microsoft.com/office/word/2015/wordml/symex" xmlns:wpg="http://schemas.microsoft.com/office/word/2010/wordprocessingGroup" xmlns:wpi="http://schemas.microsoft.com/office/word/2010/wordprocessingInk" xmlns:wne="http://schemas.microsoft.com/office/word/2006/wordml" xmlns:wps="http://schemas.microsoft.com/office/word/2010/wordprocessingShape" mc:Ignorable="w14 w15 w16se wp14">
   <w:body>
+    <w:p>
+      <w:pPr>
+        <w:jc w:val="center"/>
+        <w:rPr>
+          <w:rFonts w:hint="cs"/>
+          <w:b/>
+          <w:bCs/>
+          <w:sz w:val="48"/>
+          <w:szCs w:val="48"/>
+          <w:cs/>
+        </w:rPr>
+      </w:pPr>
+      <w:r>
+        <w:rPr>
+          <w:rFonts w:hint="cs"/>
+          <w:b/>
+          <w:bCs/>
+          <w:sz w:val="48"/>
+          <w:szCs w:val="48"/>
+          <w:cs/>
+        </w:rPr>
+        <w:t>ใบลา</w:t>
+      </w:r>
+    </w:p>
+    <w:p/>
     <w:p>
       <w:r>
         <w:rPr>

</xml_diff>